<commit_message>
creating complete data files 2020
</commit_message>
<xml_diff>
--- a/notebooks/2015_Birth/First stage 2015/01_birth_records_quality_report.docx
+++ b/notebooks/2015_Birth/First stage 2015/01_birth_records_quality_report.docx
@@ -13,12 +13,12 @@
     </w:p>
     <w:p>
       <w:r>
-        <w:t>Generated: 2026-04-01 18:30</w:t>
+        <w:t>Generated: 2026-04-30 23:38</w:t>
       </w:r>
     </w:p>
     <w:p>
       <w:r>
-        <w:t>Dataset: 336,097 birth records × 18 variables</w:t>
+        <w:t>Dataset: 336,097 birth records × 17 variables</w:t>
       </w:r>
     </w:p>
     <w:p/>
@@ -37,19 +37,19 @@
         <w:t>Key findings include:</w:t>
         <w:br/>
         <w:br/>
-        <w:t>• **Dataset Overview**: 336,097 total birth records with 18 variables</w:t>
+        <w:t>• **Dataset Overview**: 336,097 total birth records with 17 variables</w:t>
         <w:br/>
-        <w:t>• **Data Completeness**: 302,313 records (89.9%) are completely filled with no missing values</w:t>
+        <w:t>• **Data Completeness**: 302,278 records (89.9%) are completely filled with no missing values</w:t>
         <w:br/>
-        <w:t>• **Records with Missing Data**: 33,784 records (10.1%) contain at least one missing value</w:t>
+        <w:t>• **Records with Missing Data**: 33,819 records (10.1%) contain at least one missing value</w:t>
         <w:br/>
-        <w:t>• **Total Missing Values**: 33,826 missing values across all variables (0.56% of all data)</w:t>
+        <w:t>• **Total Missing Values**: 34,805 missing values across all variables (0.61% of all data)</w:t>
         <w:br/>
         <w:t>• **Average Completeness**: Each record has an average of 0.1 missing values</w:t>
         <w:br/>
-        <w:t>• **Maximum Missing**: The record with most missing data has 2 missing values</w:t>
+        <w:t>• **Maximum Missing**: The record with most missing data has 17 missing values</w:t>
         <w:br/>
-        <w:t>• **Variables with Missing Data**: 3 out of 18 variables have missing values</w:t>
+        <w:t>• **Variables with Missing Data**: 17 out of 17 variables have missing values</w:t>
         <w:br/>
         <w:t>• **Critical Variables**: ['Birth_Weight(grams)', 'Race_of_Father', 'Birth_Order'] have the highest missing rates</w:t>
       </w:r>
@@ -152,7 +152,7 @@
               <w:jc w:val="right"/>
             </w:pPr>
             <w:r>
-              <w:t>18.0</w:t>
+              <w:t>17.0</w:t>
             </w:r>
           </w:p>
         </w:tc>
@@ -177,7 +177,7 @@
               <w:jc w:val="right"/>
             </w:pPr>
             <w:r>
-              <w:t>3.0</w:t>
+              <w:t>17.0</w:t>
             </w:r>
           </w:p>
         </w:tc>
@@ -202,7 +202,7 @@
               <w:jc w:val="right"/>
             </w:pPr>
             <w:r>
-              <w:t>33826.0</w:t>
+              <w:t>34805.0</w:t>
             </w:r>
           </w:p>
         </w:tc>
@@ -227,7 +227,7 @@
               <w:jc w:val="right"/>
             </w:pPr>
             <w:r>
-              <w:t>0.56</w:t>
+              <w:t>0.61</w:t>
             </w:r>
           </w:p>
         </w:tc>
@@ -252,7 +252,7 @@
               <w:jc w:val="right"/>
             </w:pPr>
             <w:r>
-              <w:t>302313.0</w:t>
+              <w:t>302278.0</w:t>
             </w:r>
           </w:p>
         </w:tc>
@@ -277,7 +277,7 @@
               <w:jc w:val="right"/>
             </w:pPr>
             <w:r>
-              <w:t>33784.0</w:t>
+              <w:t>33819.0</w:t>
             </w:r>
           </w:p>
         </w:tc>
@@ -302,7 +302,7 @@
               <w:jc w:val="right"/>
             </w:pPr>
             <w:r>
-              <w:t>89.95</w:t>
+              <w:t>89.94</w:t>
             </w:r>
           </w:p>
         </w:tc>
@@ -327,7 +327,7 @@
               <w:jc w:val="right"/>
             </w:pPr>
             <w:r>
-              <w:t>10.05</w:t>
+              <w:t>10.06</w:t>
             </w:r>
           </w:p>
         </w:tc>
@@ -377,7 +377,7 @@
               <w:jc w:val="right"/>
             </w:pPr>
             <w:r>
-              <w:t>2.0</w:t>
+              <w:t>17.0</w:t>
             </w:r>
           </w:p>
         </w:tc>
@@ -393,7 +393,7 @@
     </w:p>
     <w:p>
       <w:r>
-        <w:t>Found 302,313 completely filled birth records (89.9% of total). These records can be used for immediate analysis without imputation.</w:t>
+        <w:t>Found 302,278 completely filled birth records (89.9% of total). These records can be used for immediate analysis without imputation.</w:t>
       </w:r>
     </w:p>
     <w:p>
@@ -411,7 +411,7 @@
     </w:p>
     <w:p>
       <w:r>
-        <w:t>Found 33,784 records with at least one missing value (10.1% of total). These records require data imputation or careful handling in analysis.</w:t>
+        <w:t>Found 33,819 records with at least one missing value (10.1% of total). These records require data imputation or careful handling in analysis.</w:t>
       </w:r>
     </w:p>
     <w:p>
@@ -431,7 +431,7 @@
       <w:r>
         <w:drawing>
           <wp:inline xmlns:a="http://schemas.openxmlformats.org/drawingml/2006/main" xmlns:pic="http://schemas.openxmlformats.org/drawingml/2006/picture">
-            <wp:extent cx="5943600" cy="4202712"/>
+            <wp:extent cx="5943600" cy="4037612"/>
             <wp:docPr id="1" name="Picture 1"/>
             <wp:cNvGraphicFramePr>
               <a:graphicFrameLocks noChangeAspect="1"/>
@@ -452,7 +452,7 @@
                   <pic:spPr>
                     <a:xfrm>
                       <a:off x="0" y="0"/>
-                      <a:ext cx="5943600" cy="4202712"/>
+                      <a:ext cx="5943600" cy="4037612"/>
                     </a:xfrm>
                     <a:prstGeom prst="rect"/>
                   </pic:spPr>
@@ -480,7 +480,7 @@
       <w:r>
         <w:drawing>
           <wp:inline xmlns:a="http://schemas.openxmlformats.org/drawingml/2006/main" xmlns:pic="http://schemas.openxmlformats.org/drawingml/2006/picture">
-            <wp:extent cx="5943600" cy="3543300"/>
+            <wp:extent cx="5943600" cy="3539717"/>
             <wp:docPr id="2" name="Picture 2"/>
             <wp:cNvGraphicFramePr>
               <a:graphicFrameLocks noChangeAspect="1"/>
@@ -501,7 +501,7 @@
                   <pic:spPr>
                     <a:xfrm>
                       <a:off x="0" y="0"/>
-                      <a:ext cx="5943600" cy="3543300"/>
+                      <a:ext cx="5943600" cy="3539717"/>
                     </a:xfrm>
                     <a:prstGeom prst="rect"/>
                   </pic:spPr>
@@ -680,7 +680,7 @@
               <w:jc w:val="right"/>
             </w:pPr>
             <w:r>
-              <w:t>33,604</w:t>
+              <w:t>33,639</w:t>
             </w:r>
           </w:p>
         </w:tc>
@@ -729,7 +729,7 @@
               <w:jc w:val="right"/>
             </w:pPr>
             <w:r>
-              <w:t>302,493</w:t>
+              <w:t>302,458</w:t>
             </w:r>
           </w:p>
         </w:tc>
@@ -767,7 +767,7 @@
               <w:jc w:val="right"/>
             </w:pPr>
             <w:r>
-              <w:t>221</w:t>
+              <w:t>280</w:t>
             </w:r>
           </w:p>
         </w:tc>
@@ -816,7 +816,7 @@
               <w:jc w:val="right"/>
             </w:pPr>
             <w:r>
-              <w:t>335,876</w:t>
+              <w:t>335,817</w:t>
             </w:r>
           </w:p>
         </w:tc>
@@ -854,7 +854,7 @@
               <w:jc w:val="right"/>
             </w:pPr>
             <w:r>
-              <w:t>1</w:t>
+              <w:t>60</w:t>
             </w:r>
           </w:p>
         </w:tc>
@@ -903,7 +903,7 @@
               <w:jc w:val="right"/>
             </w:pPr>
             <w:r>
-              <w:t>336,096</w:t>
+              <w:t>336,037</w:t>
             </w:r>
           </w:p>
         </w:tc>
@@ -941,7 +941,7 @@
               <w:jc w:val="right"/>
             </w:pPr>
             <w:r>
-              <w:t>0</w:t>
+              <w:t>59</w:t>
             </w:r>
           </w:p>
         </w:tc>
@@ -964,7 +964,7 @@
           </w:tcPr>
           <w:p>
             <w:r>
-              <w:t>int64</w:t>
+              <w:t>float64</w:t>
             </w:r>
           </w:p>
         </w:tc>
@@ -990,7 +990,7 @@
               <w:jc w:val="right"/>
             </w:pPr>
             <w:r>
-              <w:t>336,097</w:t>
+              <w:t>336,038</w:t>
             </w:r>
           </w:p>
         </w:tc>
@@ -1028,7 +1028,7 @@
               <w:jc w:val="right"/>
             </w:pPr>
             <w:r>
-              <w:t>0</w:t>
+              <w:t>59</w:t>
             </w:r>
           </w:p>
         </w:tc>
@@ -1077,7 +1077,7 @@
               <w:jc w:val="right"/>
             </w:pPr>
             <w:r>
-              <w:t>336,097</w:t>
+              <w:t>336,038</w:t>
             </w:r>
           </w:p>
         </w:tc>
@@ -1102,7 +1102,7 @@
           </w:tcPr>
           <w:p>
             <w:r>
-              <w:t>Registered_Year 2.0</w:t>
+              <w:t>Birth_Month</w:t>
             </w:r>
           </w:p>
         </w:tc>
@@ -1115,7 +1115,7 @@
               <w:jc w:val="right"/>
             </w:pPr>
             <w:r>
-              <w:t>0</w:t>
+              <w:t>59</w:t>
             </w:r>
           </w:p>
         </w:tc>
@@ -1138,7 +1138,7 @@
           </w:tcPr>
           <w:p>
             <w:r>
-              <w:t>int64</w:t>
+              <w:t>str</w:t>
             </w:r>
           </w:p>
         </w:tc>
@@ -1151,7 +1151,7 @@
               <w:jc w:val="right"/>
             </w:pPr>
             <w:r>
-              <w:t>1</w:t>
+              <w:t>12</w:t>
             </w:r>
           </w:p>
         </w:tc>
@@ -1164,94 +1164,7 @@
               <w:jc w:val="right"/>
             </w:pPr>
             <w:r>
-              <w:t>336,097</w:t>
-            </w:r>
-          </w:p>
-        </w:tc>
-        <w:tc>
-          <w:tcPr>
-            <w:tcW w:type="dxa" w:w="1234"/>
-          </w:tcPr>
-          <w:p>
-            <w:pPr>
-              <w:jc w:val="right"/>
-            </w:pPr>
-            <w:r>
-              <w:t>100.0%</w:t>
-            </w:r>
-          </w:p>
-        </w:tc>
-      </w:tr>
-      <w:tr>
-        <w:tc>
-          <w:tcPr>
-            <w:tcW w:type="dxa" w:w="1234"/>
-          </w:tcPr>
-          <w:p>
-            <w:r>
-              <w:t>Birth_Year_2.0</w:t>
-            </w:r>
-          </w:p>
-        </w:tc>
-        <w:tc>
-          <w:tcPr>
-            <w:tcW w:type="dxa" w:w="1234"/>
-          </w:tcPr>
-          <w:p>
-            <w:pPr>
-              <w:jc w:val="right"/>
-            </w:pPr>
-            <w:r>
-              <w:t>0</w:t>
-            </w:r>
-          </w:p>
-        </w:tc>
-        <w:tc>
-          <w:tcPr>
-            <w:tcW w:type="dxa" w:w="1234"/>
-          </w:tcPr>
-          <w:p>
-            <w:pPr>
-              <w:jc w:val="right"/>
-            </w:pPr>
-            <w:r>
-              <w:t>0.0%</w:t>
-            </w:r>
-          </w:p>
-        </w:tc>
-        <w:tc>
-          <w:tcPr>
-            <w:tcW w:type="dxa" w:w="1234"/>
-          </w:tcPr>
-          <w:p>
-            <w:r>
-              <w:t>int64</w:t>
-            </w:r>
-          </w:p>
-        </w:tc>
-        <w:tc>
-          <w:tcPr>
-            <w:tcW w:type="dxa" w:w="1234"/>
-          </w:tcPr>
-          <w:p>
-            <w:pPr>
-              <w:jc w:val="right"/>
-            </w:pPr>
-            <w:r>
-              <w:t>60</w:t>
-            </w:r>
-          </w:p>
-        </w:tc>
-        <w:tc>
-          <w:tcPr>
-            <w:tcW w:type="dxa" w:w="1234"/>
-          </w:tcPr>
-          <w:p>
-            <w:pPr>
-              <w:jc w:val="right"/>
-            </w:pPr>
-            <w:r>
-              <w:t>336,097</w:t>
+              <w:t>336,038</w:t>
             </w:r>
           </w:p>
         </w:tc>
@@ -1289,7 +1202,7 @@
               <w:jc w:val="right"/>
             </w:pPr>
             <w:r>
-              <w:t>0</w:t>
+              <w:t>59</w:t>
             </w:r>
           </w:p>
         </w:tc>
@@ -1338,7 +1251,7 @@
               <w:jc w:val="right"/>
             </w:pPr>
             <w:r>
-              <w:t>336,097</w:t>
+              <w:t>336,038</w:t>
             </w:r>
           </w:p>
         </w:tc>
@@ -1376,7 +1289,7 @@
               <w:jc w:val="right"/>
             </w:pPr>
             <w:r>
-              <w:t>0</w:t>
+              <w:t>59</w:t>
             </w:r>
           </w:p>
         </w:tc>
@@ -1399,7 +1312,7 @@
           </w:tcPr>
           <w:p>
             <w:r>
-              <w:t>int64</w:t>
+              <w:t>float64</w:t>
             </w:r>
           </w:p>
         </w:tc>
@@ -1425,7 +1338,7 @@
               <w:jc w:val="right"/>
             </w:pPr>
             <w:r>
-              <w:t>336,097</w:t>
+              <w:t>336,038</w:t>
             </w:r>
           </w:p>
         </w:tc>
@@ -1450,7 +1363,7 @@
           </w:tcPr>
           <w:p>
             <w:r>
-              <w:t>Birth_Month</w:t>
+              <w:t>Birh_Year 2.0</w:t>
             </w:r>
           </w:p>
         </w:tc>
@@ -1463,7 +1376,703 @@
               <w:jc w:val="right"/>
             </w:pPr>
             <w:r>
-              <w:t>0</w:t>
+              <w:t>59</w:t>
+            </w:r>
+          </w:p>
+        </w:tc>
+        <w:tc>
+          <w:tcPr>
+            <w:tcW w:type="dxa" w:w="1234"/>
+          </w:tcPr>
+          <w:p>
+            <w:pPr>
+              <w:jc w:val="right"/>
+            </w:pPr>
+            <w:r>
+              <w:t>0.0%</w:t>
+            </w:r>
+          </w:p>
+        </w:tc>
+        <w:tc>
+          <w:tcPr>
+            <w:tcW w:type="dxa" w:w="1234"/>
+          </w:tcPr>
+          <w:p>
+            <w:r>
+              <w:t>float64</w:t>
+            </w:r>
+          </w:p>
+        </w:tc>
+        <w:tc>
+          <w:tcPr>
+            <w:tcW w:type="dxa" w:w="1234"/>
+          </w:tcPr>
+          <w:p>
+            <w:pPr>
+              <w:jc w:val="right"/>
+            </w:pPr>
+            <w:r>
+              <w:t>60</w:t>
+            </w:r>
+          </w:p>
+        </w:tc>
+        <w:tc>
+          <w:tcPr>
+            <w:tcW w:type="dxa" w:w="1234"/>
+          </w:tcPr>
+          <w:p>
+            <w:pPr>
+              <w:jc w:val="right"/>
+            </w:pPr>
+            <w:r>
+              <w:t>336,038</w:t>
+            </w:r>
+          </w:p>
+        </w:tc>
+        <w:tc>
+          <w:tcPr>
+            <w:tcW w:type="dxa" w:w="1234"/>
+          </w:tcPr>
+          <w:p>
+            <w:pPr>
+              <w:jc w:val="right"/>
+            </w:pPr>
+            <w:r>
+              <w:t>100.0%</w:t>
+            </w:r>
+          </w:p>
+        </w:tc>
+      </w:tr>
+      <w:tr>
+        <w:tc>
+          <w:tcPr>
+            <w:tcW w:type="dxa" w:w="1234"/>
+          </w:tcPr>
+          <w:p>
+            <w:r>
+              <w:t>Twin</w:t>
+            </w:r>
+          </w:p>
+        </w:tc>
+        <w:tc>
+          <w:tcPr>
+            <w:tcW w:type="dxa" w:w="1234"/>
+          </w:tcPr>
+          <w:p>
+            <w:pPr>
+              <w:jc w:val="right"/>
+            </w:pPr>
+            <w:r>
+              <w:t>59</w:t>
+            </w:r>
+          </w:p>
+        </w:tc>
+        <w:tc>
+          <w:tcPr>
+            <w:tcW w:type="dxa" w:w="1234"/>
+          </w:tcPr>
+          <w:p>
+            <w:pPr>
+              <w:jc w:val="right"/>
+            </w:pPr>
+            <w:r>
+              <w:t>0.0%</w:t>
+            </w:r>
+          </w:p>
+        </w:tc>
+        <w:tc>
+          <w:tcPr>
+            <w:tcW w:type="dxa" w:w="1234"/>
+          </w:tcPr>
+          <w:p>
+            <w:r>
+              <w:t>float64</w:t>
+            </w:r>
+          </w:p>
+        </w:tc>
+        <w:tc>
+          <w:tcPr>
+            <w:tcW w:type="dxa" w:w="1234"/>
+          </w:tcPr>
+          <w:p>
+            <w:pPr>
+              <w:jc w:val="right"/>
+            </w:pPr>
+            <w:r>
+              <w:t>4</w:t>
+            </w:r>
+          </w:p>
+        </w:tc>
+        <w:tc>
+          <w:tcPr>
+            <w:tcW w:type="dxa" w:w="1234"/>
+          </w:tcPr>
+          <w:p>
+            <w:pPr>
+              <w:jc w:val="right"/>
+            </w:pPr>
+            <w:r>
+              <w:t>336,038</w:t>
+            </w:r>
+          </w:p>
+        </w:tc>
+        <w:tc>
+          <w:tcPr>
+            <w:tcW w:type="dxa" w:w="1234"/>
+          </w:tcPr>
+          <w:p>
+            <w:pPr>
+              <w:jc w:val="right"/>
+            </w:pPr>
+            <w:r>
+              <w:t>100.0%</w:t>
+            </w:r>
+          </w:p>
+        </w:tc>
+      </w:tr>
+      <w:tr>
+        <w:tc>
+          <w:tcPr>
+            <w:tcW w:type="dxa" w:w="1234"/>
+          </w:tcPr>
+          <w:p>
+            <w:r>
+              <w:t>Hospital or Not</w:t>
+            </w:r>
+          </w:p>
+        </w:tc>
+        <w:tc>
+          <w:tcPr>
+            <w:tcW w:type="dxa" w:w="1234"/>
+          </w:tcPr>
+          <w:p>
+            <w:pPr>
+              <w:jc w:val="right"/>
+            </w:pPr>
+            <w:r>
+              <w:t>59</w:t>
+            </w:r>
+          </w:p>
+        </w:tc>
+        <w:tc>
+          <w:tcPr>
+            <w:tcW w:type="dxa" w:w="1234"/>
+          </w:tcPr>
+          <w:p>
+            <w:pPr>
+              <w:jc w:val="right"/>
+            </w:pPr>
+            <w:r>
+              <w:t>0.0%</w:t>
+            </w:r>
+          </w:p>
+        </w:tc>
+        <w:tc>
+          <w:tcPr>
+            <w:tcW w:type="dxa" w:w="1234"/>
+          </w:tcPr>
+          <w:p>
+            <w:r>
+              <w:t>str</w:t>
+            </w:r>
+          </w:p>
+        </w:tc>
+        <w:tc>
+          <w:tcPr>
+            <w:tcW w:type="dxa" w:w="1234"/>
+          </w:tcPr>
+          <w:p>
+            <w:pPr>
+              <w:jc w:val="right"/>
+            </w:pPr>
+            <w:r>
+              <w:t>2</w:t>
+            </w:r>
+          </w:p>
+        </w:tc>
+        <w:tc>
+          <w:tcPr>
+            <w:tcW w:type="dxa" w:w="1234"/>
+          </w:tcPr>
+          <w:p>
+            <w:pPr>
+              <w:jc w:val="right"/>
+            </w:pPr>
+            <w:r>
+              <w:t>336,038</w:t>
+            </w:r>
+          </w:p>
+        </w:tc>
+        <w:tc>
+          <w:tcPr>
+            <w:tcW w:type="dxa" w:w="1234"/>
+          </w:tcPr>
+          <w:p>
+            <w:pPr>
+              <w:jc w:val="right"/>
+            </w:pPr>
+            <w:r>
+              <w:t>100.0%</w:t>
+            </w:r>
+          </w:p>
+        </w:tc>
+      </w:tr>
+      <w:tr>
+        <w:tc>
+          <w:tcPr>
+            <w:tcW w:type="dxa" w:w="1234"/>
+          </w:tcPr>
+          <w:p>
+            <w:r>
+              <w:t xml:space="preserve">Gender </w:t>
+            </w:r>
+          </w:p>
+        </w:tc>
+        <w:tc>
+          <w:tcPr>
+            <w:tcW w:type="dxa" w:w="1234"/>
+          </w:tcPr>
+          <w:p>
+            <w:pPr>
+              <w:jc w:val="right"/>
+            </w:pPr>
+            <w:r>
+              <w:t>59</w:t>
+            </w:r>
+          </w:p>
+        </w:tc>
+        <w:tc>
+          <w:tcPr>
+            <w:tcW w:type="dxa" w:w="1234"/>
+          </w:tcPr>
+          <w:p>
+            <w:pPr>
+              <w:jc w:val="right"/>
+            </w:pPr>
+            <w:r>
+              <w:t>0.0%</w:t>
+            </w:r>
+          </w:p>
+        </w:tc>
+        <w:tc>
+          <w:tcPr>
+            <w:tcW w:type="dxa" w:w="1234"/>
+          </w:tcPr>
+          <w:p>
+            <w:r>
+              <w:t>str</w:t>
+            </w:r>
+          </w:p>
+        </w:tc>
+        <w:tc>
+          <w:tcPr>
+            <w:tcW w:type="dxa" w:w="1234"/>
+          </w:tcPr>
+          <w:p>
+            <w:pPr>
+              <w:jc w:val="right"/>
+            </w:pPr>
+            <w:r>
+              <w:t>2</w:t>
+            </w:r>
+          </w:p>
+        </w:tc>
+        <w:tc>
+          <w:tcPr>
+            <w:tcW w:type="dxa" w:w="1234"/>
+          </w:tcPr>
+          <w:p>
+            <w:pPr>
+              <w:jc w:val="right"/>
+            </w:pPr>
+            <w:r>
+              <w:t>336,038</w:t>
+            </w:r>
+          </w:p>
+        </w:tc>
+        <w:tc>
+          <w:tcPr>
+            <w:tcW w:type="dxa" w:w="1234"/>
+          </w:tcPr>
+          <w:p>
+            <w:pPr>
+              <w:jc w:val="right"/>
+            </w:pPr>
+            <w:r>
+              <w:t>100.0%</w:t>
+            </w:r>
+          </w:p>
+        </w:tc>
+      </w:tr>
+      <w:tr>
+        <w:tc>
+          <w:tcPr>
+            <w:tcW w:type="dxa" w:w="1234"/>
+          </w:tcPr>
+          <w:p>
+            <w:r>
+              <w:t>Multiple_Birth_Status</w:t>
+            </w:r>
+          </w:p>
+        </w:tc>
+        <w:tc>
+          <w:tcPr>
+            <w:tcW w:type="dxa" w:w="1234"/>
+          </w:tcPr>
+          <w:p>
+            <w:pPr>
+              <w:jc w:val="right"/>
+            </w:pPr>
+            <w:r>
+              <w:t>59</w:t>
+            </w:r>
+          </w:p>
+        </w:tc>
+        <w:tc>
+          <w:tcPr>
+            <w:tcW w:type="dxa" w:w="1234"/>
+          </w:tcPr>
+          <w:p>
+            <w:pPr>
+              <w:jc w:val="right"/>
+            </w:pPr>
+            <w:r>
+              <w:t>0.0%</w:t>
+            </w:r>
+          </w:p>
+        </w:tc>
+        <w:tc>
+          <w:tcPr>
+            <w:tcW w:type="dxa" w:w="1234"/>
+          </w:tcPr>
+          <w:p>
+            <w:r>
+              <w:t>str</w:t>
+            </w:r>
+          </w:p>
+        </w:tc>
+        <w:tc>
+          <w:tcPr>
+            <w:tcW w:type="dxa" w:w="1234"/>
+          </w:tcPr>
+          <w:p>
+            <w:pPr>
+              <w:jc w:val="right"/>
+            </w:pPr>
+            <w:r>
+              <w:t>4</w:t>
+            </w:r>
+          </w:p>
+        </w:tc>
+        <w:tc>
+          <w:tcPr>
+            <w:tcW w:type="dxa" w:w="1234"/>
+          </w:tcPr>
+          <w:p>
+            <w:pPr>
+              <w:jc w:val="right"/>
+            </w:pPr>
+            <w:r>
+              <w:t>336,038</w:t>
+            </w:r>
+          </w:p>
+        </w:tc>
+        <w:tc>
+          <w:tcPr>
+            <w:tcW w:type="dxa" w:w="1234"/>
+          </w:tcPr>
+          <w:p>
+            <w:pPr>
+              <w:jc w:val="right"/>
+            </w:pPr>
+            <w:r>
+              <w:t>100.0%</w:t>
+            </w:r>
+          </w:p>
+        </w:tc>
+      </w:tr>
+      <w:tr>
+        <w:tc>
+          <w:tcPr>
+            <w:tcW w:type="dxa" w:w="1234"/>
+          </w:tcPr>
+          <w:p>
+            <w:r>
+              <w:t>Age of Mother</w:t>
+            </w:r>
+          </w:p>
+        </w:tc>
+        <w:tc>
+          <w:tcPr>
+            <w:tcW w:type="dxa" w:w="1234"/>
+          </w:tcPr>
+          <w:p>
+            <w:pPr>
+              <w:jc w:val="right"/>
+            </w:pPr>
+            <w:r>
+              <w:t>59</w:t>
+            </w:r>
+          </w:p>
+        </w:tc>
+        <w:tc>
+          <w:tcPr>
+            <w:tcW w:type="dxa" w:w="1234"/>
+          </w:tcPr>
+          <w:p>
+            <w:pPr>
+              <w:jc w:val="right"/>
+            </w:pPr>
+            <w:r>
+              <w:t>0.0%</w:t>
+            </w:r>
+          </w:p>
+        </w:tc>
+        <w:tc>
+          <w:tcPr>
+            <w:tcW w:type="dxa" w:w="1234"/>
+          </w:tcPr>
+          <w:p>
+            <w:r>
+              <w:t>float64</w:t>
+            </w:r>
+          </w:p>
+        </w:tc>
+        <w:tc>
+          <w:tcPr>
+            <w:tcW w:type="dxa" w:w="1234"/>
+          </w:tcPr>
+          <w:p>
+            <w:pPr>
+              <w:jc w:val="right"/>
+            </w:pPr>
+            <w:r>
+              <w:t>41</w:t>
+            </w:r>
+          </w:p>
+        </w:tc>
+        <w:tc>
+          <w:tcPr>
+            <w:tcW w:type="dxa" w:w="1234"/>
+          </w:tcPr>
+          <w:p>
+            <w:pPr>
+              <w:jc w:val="right"/>
+            </w:pPr>
+            <w:r>
+              <w:t>336,038</w:t>
+            </w:r>
+          </w:p>
+        </w:tc>
+        <w:tc>
+          <w:tcPr>
+            <w:tcW w:type="dxa" w:w="1234"/>
+          </w:tcPr>
+          <w:p>
+            <w:pPr>
+              <w:jc w:val="right"/>
+            </w:pPr>
+            <w:r>
+              <w:t>100.0%</w:t>
+            </w:r>
+          </w:p>
+        </w:tc>
+      </w:tr>
+      <w:tr>
+        <w:tc>
+          <w:tcPr>
+            <w:tcW w:type="dxa" w:w="1234"/>
+          </w:tcPr>
+          <w:p>
+            <w:r>
+              <w:t>Marital_Status</w:t>
+            </w:r>
+          </w:p>
+        </w:tc>
+        <w:tc>
+          <w:tcPr>
+            <w:tcW w:type="dxa" w:w="1234"/>
+          </w:tcPr>
+          <w:p>
+            <w:pPr>
+              <w:jc w:val="right"/>
+            </w:pPr>
+            <w:r>
+              <w:t>59</w:t>
+            </w:r>
+          </w:p>
+        </w:tc>
+        <w:tc>
+          <w:tcPr>
+            <w:tcW w:type="dxa" w:w="1234"/>
+          </w:tcPr>
+          <w:p>
+            <w:pPr>
+              <w:jc w:val="right"/>
+            </w:pPr>
+            <w:r>
+              <w:t>0.0%</w:t>
+            </w:r>
+          </w:p>
+        </w:tc>
+        <w:tc>
+          <w:tcPr>
+            <w:tcW w:type="dxa" w:w="1234"/>
+          </w:tcPr>
+          <w:p>
+            <w:r>
+              <w:t>str</w:t>
+            </w:r>
+          </w:p>
+        </w:tc>
+        <w:tc>
+          <w:tcPr>
+            <w:tcW w:type="dxa" w:w="1234"/>
+          </w:tcPr>
+          <w:p>
+            <w:pPr>
+              <w:jc w:val="right"/>
+            </w:pPr>
+            <w:r>
+              <w:t>2</w:t>
+            </w:r>
+          </w:p>
+        </w:tc>
+        <w:tc>
+          <w:tcPr>
+            <w:tcW w:type="dxa" w:w="1234"/>
+          </w:tcPr>
+          <w:p>
+            <w:pPr>
+              <w:jc w:val="right"/>
+            </w:pPr>
+            <w:r>
+              <w:t>336,038</w:t>
+            </w:r>
+          </w:p>
+        </w:tc>
+        <w:tc>
+          <w:tcPr>
+            <w:tcW w:type="dxa" w:w="1234"/>
+          </w:tcPr>
+          <w:p>
+            <w:pPr>
+              <w:jc w:val="right"/>
+            </w:pPr>
+            <w:r>
+              <w:t>100.0%</w:t>
+            </w:r>
+          </w:p>
+        </w:tc>
+      </w:tr>
+      <w:tr>
+        <w:tc>
+          <w:tcPr>
+            <w:tcW w:type="dxa" w:w="1234"/>
+          </w:tcPr>
+          <w:p>
+            <w:r>
+              <w:t>District_of_Mother</w:t>
+            </w:r>
+          </w:p>
+        </w:tc>
+        <w:tc>
+          <w:tcPr>
+            <w:tcW w:type="dxa" w:w="1234"/>
+          </w:tcPr>
+          <w:p>
+            <w:pPr>
+              <w:jc w:val="right"/>
+            </w:pPr>
+            <w:r>
+              <w:t>59</w:t>
+            </w:r>
+          </w:p>
+        </w:tc>
+        <w:tc>
+          <w:tcPr>
+            <w:tcW w:type="dxa" w:w="1234"/>
+          </w:tcPr>
+          <w:p>
+            <w:pPr>
+              <w:jc w:val="right"/>
+            </w:pPr>
+            <w:r>
+              <w:t>0.0%</w:t>
+            </w:r>
+          </w:p>
+        </w:tc>
+        <w:tc>
+          <w:tcPr>
+            <w:tcW w:type="dxa" w:w="1234"/>
+          </w:tcPr>
+          <w:p>
+            <w:r>
+              <w:t>str</w:t>
+            </w:r>
+          </w:p>
+        </w:tc>
+        <w:tc>
+          <w:tcPr>
+            <w:tcW w:type="dxa" w:w="1234"/>
+          </w:tcPr>
+          <w:p>
+            <w:pPr>
+              <w:jc w:val="right"/>
+            </w:pPr>
+            <w:r>
+              <w:t>25</w:t>
+            </w:r>
+          </w:p>
+        </w:tc>
+        <w:tc>
+          <w:tcPr>
+            <w:tcW w:type="dxa" w:w="1234"/>
+          </w:tcPr>
+          <w:p>
+            <w:pPr>
+              <w:jc w:val="right"/>
+            </w:pPr>
+            <w:r>
+              <w:t>336,038</w:t>
+            </w:r>
+          </w:p>
+        </w:tc>
+        <w:tc>
+          <w:tcPr>
+            <w:tcW w:type="dxa" w:w="1234"/>
+          </w:tcPr>
+          <w:p>
+            <w:pPr>
+              <w:jc w:val="right"/>
+            </w:pPr>
+            <w:r>
+              <w:t>100.0%</w:t>
+            </w:r>
+          </w:p>
+        </w:tc>
+      </w:tr>
+      <w:tr>
+        <w:tc>
+          <w:tcPr>
+            <w:tcW w:type="dxa" w:w="1234"/>
+          </w:tcPr>
+          <w:p>
+            <w:r>
+              <w:t>Race_of_Mother</w:t>
+            </w:r>
+          </w:p>
+        </w:tc>
+        <w:tc>
+          <w:tcPr>
+            <w:tcW w:type="dxa" w:w="1234"/>
+          </w:tcPr>
+          <w:p>
+            <w:pPr>
+              <w:jc w:val="right"/>
+            </w:pPr>
+            <w:r>
+              <w:t>59</w:t>
             </w:r>
           </w:p>
         </w:tc>
@@ -1512,703 +2121,7 @@
               <w:jc w:val="right"/>
             </w:pPr>
             <w:r>
-              <w:t>336,097</w:t>
-            </w:r>
-          </w:p>
-        </w:tc>
-        <w:tc>
-          <w:tcPr>
-            <w:tcW w:type="dxa" w:w="1234"/>
-          </w:tcPr>
-          <w:p>
-            <w:pPr>
-              <w:jc w:val="right"/>
-            </w:pPr>
-            <w:r>
-              <w:t>100.0%</w:t>
-            </w:r>
-          </w:p>
-        </w:tc>
-      </w:tr>
-      <w:tr>
-        <w:tc>
-          <w:tcPr>
-            <w:tcW w:type="dxa" w:w="1234"/>
-          </w:tcPr>
-          <w:p>
-            <w:r>
-              <w:t>TWIN</w:t>
-            </w:r>
-          </w:p>
-        </w:tc>
-        <w:tc>
-          <w:tcPr>
-            <w:tcW w:type="dxa" w:w="1234"/>
-          </w:tcPr>
-          <w:p>
-            <w:pPr>
-              <w:jc w:val="right"/>
-            </w:pPr>
-            <w:r>
-              <w:t>0</w:t>
-            </w:r>
-          </w:p>
-        </w:tc>
-        <w:tc>
-          <w:tcPr>
-            <w:tcW w:type="dxa" w:w="1234"/>
-          </w:tcPr>
-          <w:p>
-            <w:pPr>
-              <w:jc w:val="right"/>
-            </w:pPr>
-            <w:r>
-              <w:t>0.0%</w:t>
-            </w:r>
-          </w:p>
-        </w:tc>
-        <w:tc>
-          <w:tcPr>
-            <w:tcW w:type="dxa" w:w="1234"/>
-          </w:tcPr>
-          <w:p>
-            <w:r>
-              <w:t>int64</w:t>
-            </w:r>
-          </w:p>
-        </w:tc>
-        <w:tc>
-          <w:tcPr>
-            <w:tcW w:type="dxa" w:w="1234"/>
-          </w:tcPr>
-          <w:p>
-            <w:pPr>
-              <w:jc w:val="right"/>
-            </w:pPr>
-            <w:r>
-              <w:t>4</w:t>
-            </w:r>
-          </w:p>
-        </w:tc>
-        <w:tc>
-          <w:tcPr>
-            <w:tcW w:type="dxa" w:w="1234"/>
-          </w:tcPr>
-          <w:p>
-            <w:pPr>
-              <w:jc w:val="right"/>
-            </w:pPr>
-            <w:r>
-              <w:t>336,097</w:t>
-            </w:r>
-          </w:p>
-        </w:tc>
-        <w:tc>
-          <w:tcPr>
-            <w:tcW w:type="dxa" w:w="1234"/>
-          </w:tcPr>
-          <w:p>
-            <w:pPr>
-              <w:jc w:val="right"/>
-            </w:pPr>
-            <w:r>
-              <w:t>100.0%</w:t>
-            </w:r>
-          </w:p>
-        </w:tc>
-      </w:tr>
-      <w:tr>
-        <w:tc>
-          <w:tcPr>
-            <w:tcW w:type="dxa" w:w="1234"/>
-          </w:tcPr>
-          <w:p>
-            <w:r>
-              <w:t>Hospital or Not</w:t>
-            </w:r>
-          </w:p>
-        </w:tc>
-        <w:tc>
-          <w:tcPr>
-            <w:tcW w:type="dxa" w:w="1234"/>
-          </w:tcPr>
-          <w:p>
-            <w:pPr>
-              <w:jc w:val="right"/>
-            </w:pPr>
-            <w:r>
-              <w:t>0</w:t>
-            </w:r>
-          </w:p>
-        </w:tc>
-        <w:tc>
-          <w:tcPr>
-            <w:tcW w:type="dxa" w:w="1234"/>
-          </w:tcPr>
-          <w:p>
-            <w:pPr>
-              <w:jc w:val="right"/>
-            </w:pPr>
-            <w:r>
-              <w:t>0.0%</w:t>
-            </w:r>
-          </w:p>
-        </w:tc>
-        <w:tc>
-          <w:tcPr>
-            <w:tcW w:type="dxa" w:w="1234"/>
-          </w:tcPr>
-          <w:p>
-            <w:r>
-              <w:t>str</w:t>
-            </w:r>
-          </w:p>
-        </w:tc>
-        <w:tc>
-          <w:tcPr>
-            <w:tcW w:type="dxa" w:w="1234"/>
-          </w:tcPr>
-          <w:p>
-            <w:pPr>
-              <w:jc w:val="right"/>
-            </w:pPr>
-            <w:r>
-              <w:t>2</w:t>
-            </w:r>
-          </w:p>
-        </w:tc>
-        <w:tc>
-          <w:tcPr>
-            <w:tcW w:type="dxa" w:w="1234"/>
-          </w:tcPr>
-          <w:p>
-            <w:pPr>
-              <w:jc w:val="right"/>
-            </w:pPr>
-            <w:r>
-              <w:t>336,097</w:t>
-            </w:r>
-          </w:p>
-        </w:tc>
-        <w:tc>
-          <w:tcPr>
-            <w:tcW w:type="dxa" w:w="1234"/>
-          </w:tcPr>
-          <w:p>
-            <w:pPr>
-              <w:jc w:val="right"/>
-            </w:pPr>
-            <w:r>
-              <w:t>100.0%</w:t>
-            </w:r>
-          </w:p>
-        </w:tc>
-      </w:tr>
-      <w:tr>
-        <w:tc>
-          <w:tcPr>
-            <w:tcW w:type="dxa" w:w="1234"/>
-          </w:tcPr>
-          <w:p>
-            <w:r>
-              <w:t>Gender</w:t>
-            </w:r>
-          </w:p>
-        </w:tc>
-        <w:tc>
-          <w:tcPr>
-            <w:tcW w:type="dxa" w:w="1234"/>
-          </w:tcPr>
-          <w:p>
-            <w:pPr>
-              <w:jc w:val="right"/>
-            </w:pPr>
-            <w:r>
-              <w:t>0</w:t>
-            </w:r>
-          </w:p>
-        </w:tc>
-        <w:tc>
-          <w:tcPr>
-            <w:tcW w:type="dxa" w:w="1234"/>
-          </w:tcPr>
-          <w:p>
-            <w:pPr>
-              <w:jc w:val="right"/>
-            </w:pPr>
-            <w:r>
-              <w:t>0.0%</w:t>
-            </w:r>
-          </w:p>
-        </w:tc>
-        <w:tc>
-          <w:tcPr>
-            <w:tcW w:type="dxa" w:w="1234"/>
-          </w:tcPr>
-          <w:p>
-            <w:r>
-              <w:t>str</w:t>
-            </w:r>
-          </w:p>
-        </w:tc>
-        <w:tc>
-          <w:tcPr>
-            <w:tcW w:type="dxa" w:w="1234"/>
-          </w:tcPr>
-          <w:p>
-            <w:pPr>
-              <w:jc w:val="right"/>
-            </w:pPr>
-            <w:r>
-              <w:t>2</w:t>
-            </w:r>
-          </w:p>
-        </w:tc>
-        <w:tc>
-          <w:tcPr>
-            <w:tcW w:type="dxa" w:w="1234"/>
-          </w:tcPr>
-          <w:p>
-            <w:pPr>
-              <w:jc w:val="right"/>
-            </w:pPr>
-            <w:r>
-              <w:t>336,097</w:t>
-            </w:r>
-          </w:p>
-        </w:tc>
-        <w:tc>
-          <w:tcPr>
-            <w:tcW w:type="dxa" w:w="1234"/>
-          </w:tcPr>
-          <w:p>
-            <w:pPr>
-              <w:jc w:val="right"/>
-            </w:pPr>
-            <w:r>
-              <w:t>100.0%</w:t>
-            </w:r>
-          </w:p>
-        </w:tc>
-      </w:tr>
-      <w:tr>
-        <w:tc>
-          <w:tcPr>
-            <w:tcW w:type="dxa" w:w="1234"/>
-          </w:tcPr>
-          <w:p>
-            <w:r>
-              <w:t>Multiple_Birth_Status</w:t>
-            </w:r>
-          </w:p>
-        </w:tc>
-        <w:tc>
-          <w:tcPr>
-            <w:tcW w:type="dxa" w:w="1234"/>
-          </w:tcPr>
-          <w:p>
-            <w:pPr>
-              <w:jc w:val="right"/>
-            </w:pPr>
-            <w:r>
-              <w:t>0</w:t>
-            </w:r>
-          </w:p>
-        </w:tc>
-        <w:tc>
-          <w:tcPr>
-            <w:tcW w:type="dxa" w:w="1234"/>
-          </w:tcPr>
-          <w:p>
-            <w:pPr>
-              <w:jc w:val="right"/>
-            </w:pPr>
-            <w:r>
-              <w:t>0.0%</w:t>
-            </w:r>
-          </w:p>
-        </w:tc>
-        <w:tc>
-          <w:tcPr>
-            <w:tcW w:type="dxa" w:w="1234"/>
-          </w:tcPr>
-          <w:p>
-            <w:r>
-              <w:t>str</w:t>
-            </w:r>
-          </w:p>
-        </w:tc>
-        <w:tc>
-          <w:tcPr>
-            <w:tcW w:type="dxa" w:w="1234"/>
-          </w:tcPr>
-          <w:p>
-            <w:pPr>
-              <w:jc w:val="right"/>
-            </w:pPr>
-            <w:r>
-              <w:t>4</w:t>
-            </w:r>
-          </w:p>
-        </w:tc>
-        <w:tc>
-          <w:tcPr>
-            <w:tcW w:type="dxa" w:w="1234"/>
-          </w:tcPr>
-          <w:p>
-            <w:pPr>
-              <w:jc w:val="right"/>
-            </w:pPr>
-            <w:r>
-              <w:t>336,097</w:t>
-            </w:r>
-          </w:p>
-        </w:tc>
-        <w:tc>
-          <w:tcPr>
-            <w:tcW w:type="dxa" w:w="1234"/>
-          </w:tcPr>
-          <w:p>
-            <w:pPr>
-              <w:jc w:val="right"/>
-            </w:pPr>
-            <w:r>
-              <w:t>100.0%</w:t>
-            </w:r>
-          </w:p>
-        </w:tc>
-      </w:tr>
-      <w:tr>
-        <w:tc>
-          <w:tcPr>
-            <w:tcW w:type="dxa" w:w="1234"/>
-          </w:tcPr>
-          <w:p>
-            <w:r>
-              <w:t>Age of Mother</w:t>
-            </w:r>
-          </w:p>
-        </w:tc>
-        <w:tc>
-          <w:tcPr>
-            <w:tcW w:type="dxa" w:w="1234"/>
-          </w:tcPr>
-          <w:p>
-            <w:pPr>
-              <w:jc w:val="right"/>
-            </w:pPr>
-            <w:r>
-              <w:t>0</w:t>
-            </w:r>
-          </w:p>
-        </w:tc>
-        <w:tc>
-          <w:tcPr>
-            <w:tcW w:type="dxa" w:w="1234"/>
-          </w:tcPr>
-          <w:p>
-            <w:pPr>
-              <w:jc w:val="right"/>
-            </w:pPr>
-            <w:r>
-              <w:t>0.0%</w:t>
-            </w:r>
-          </w:p>
-        </w:tc>
-        <w:tc>
-          <w:tcPr>
-            <w:tcW w:type="dxa" w:w="1234"/>
-          </w:tcPr>
-          <w:p>
-            <w:r>
-              <w:t>int64</w:t>
-            </w:r>
-          </w:p>
-        </w:tc>
-        <w:tc>
-          <w:tcPr>
-            <w:tcW w:type="dxa" w:w="1234"/>
-          </w:tcPr>
-          <w:p>
-            <w:pPr>
-              <w:jc w:val="right"/>
-            </w:pPr>
-            <w:r>
-              <w:t>41</w:t>
-            </w:r>
-          </w:p>
-        </w:tc>
-        <w:tc>
-          <w:tcPr>
-            <w:tcW w:type="dxa" w:w="1234"/>
-          </w:tcPr>
-          <w:p>
-            <w:pPr>
-              <w:jc w:val="right"/>
-            </w:pPr>
-            <w:r>
-              <w:t>336,097</w:t>
-            </w:r>
-          </w:p>
-        </w:tc>
-        <w:tc>
-          <w:tcPr>
-            <w:tcW w:type="dxa" w:w="1234"/>
-          </w:tcPr>
-          <w:p>
-            <w:pPr>
-              <w:jc w:val="right"/>
-            </w:pPr>
-            <w:r>
-              <w:t>100.0%</w:t>
-            </w:r>
-          </w:p>
-        </w:tc>
-      </w:tr>
-      <w:tr>
-        <w:tc>
-          <w:tcPr>
-            <w:tcW w:type="dxa" w:w="1234"/>
-          </w:tcPr>
-          <w:p>
-            <w:r>
-              <w:t>Marital_Status</w:t>
-            </w:r>
-          </w:p>
-        </w:tc>
-        <w:tc>
-          <w:tcPr>
-            <w:tcW w:type="dxa" w:w="1234"/>
-          </w:tcPr>
-          <w:p>
-            <w:pPr>
-              <w:jc w:val="right"/>
-            </w:pPr>
-            <w:r>
-              <w:t>0</w:t>
-            </w:r>
-          </w:p>
-        </w:tc>
-        <w:tc>
-          <w:tcPr>
-            <w:tcW w:type="dxa" w:w="1234"/>
-          </w:tcPr>
-          <w:p>
-            <w:pPr>
-              <w:jc w:val="right"/>
-            </w:pPr>
-            <w:r>
-              <w:t>0.0%</w:t>
-            </w:r>
-          </w:p>
-        </w:tc>
-        <w:tc>
-          <w:tcPr>
-            <w:tcW w:type="dxa" w:w="1234"/>
-          </w:tcPr>
-          <w:p>
-            <w:r>
-              <w:t>str</w:t>
-            </w:r>
-          </w:p>
-        </w:tc>
-        <w:tc>
-          <w:tcPr>
-            <w:tcW w:type="dxa" w:w="1234"/>
-          </w:tcPr>
-          <w:p>
-            <w:pPr>
-              <w:jc w:val="right"/>
-            </w:pPr>
-            <w:r>
-              <w:t>2</w:t>
-            </w:r>
-          </w:p>
-        </w:tc>
-        <w:tc>
-          <w:tcPr>
-            <w:tcW w:type="dxa" w:w="1234"/>
-          </w:tcPr>
-          <w:p>
-            <w:pPr>
-              <w:jc w:val="right"/>
-            </w:pPr>
-            <w:r>
-              <w:t>336,097</w:t>
-            </w:r>
-          </w:p>
-        </w:tc>
-        <w:tc>
-          <w:tcPr>
-            <w:tcW w:type="dxa" w:w="1234"/>
-          </w:tcPr>
-          <w:p>
-            <w:pPr>
-              <w:jc w:val="right"/>
-            </w:pPr>
-            <w:r>
-              <w:t>100.0%</w:t>
-            </w:r>
-          </w:p>
-        </w:tc>
-      </w:tr>
-      <w:tr>
-        <w:tc>
-          <w:tcPr>
-            <w:tcW w:type="dxa" w:w="1234"/>
-          </w:tcPr>
-          <w:p>
-            <w:r>
-              <w:t>District_of_Mother</w:t>
-            </w:r>
-          </w:p>
-        </w:tc>
-        <w:tc>
-          <w:tcPr>
-            <w:tcW w:type="dxa" w:w="1234"/>
-          </w:tcPr>
-          <w:p>
-            <w:pPr>
-              <w:jc w:val="right"/>
-            </w:pPr>
-            <w:r>
-              <w:t>0</w:t>
-            </w:r>
-          </w:p>
-        </w:tc>
-        <w:tc>
-          <w:tcPr>
-            <w:tcW w:type="dxa" w:w="1234"/>
-          </w:tcPr>
-          <w:p>
-            <w:pPr>
-              <w:jc w:val="right"/>
-            </w:pPr>
-            <w:r>
-              <w:t>0.0%</w:t>
-            </w:r>
-          </w:p>
-        </w:tc>
-        <w:tc>
-          <w:tcPr>
-            <w:tcW w:type="dxa" w:w="1234"/>
-          </w:tcPr>
-          <w:p>
-            <w:r>
-              <w:t>str</w:t>
-            </w:r>
-          </w:p>
-        </w:tc>
-        <w:tc>
-          <w:tcPr>
-            <w:tcW w:type="dxa" w:w="1234"/>
-          </w:tcPr>
-          <w:p>
-            <w:pPr>
-              <w:jc w:val="right"/>
-            </w:pPr>
-            <w:r>
-              <w:t>26</w:t>
-            </w:r>
-          </w:p>
-        </w:tc>
-        <w:tc>
-          <w:tcPr>
-            <w:tcW w:type="dxa" w:w="1234"/>
-          </w:tcPr>
-          <w:p>
-            <w:pPr>
-              <w:jc w:val="right"/>
-            </w:pPr>
-            <w:r>
-              <w:t>336,097</w:t>
-            </w:r>
-          </w:p>
-        </w:tc>
-        <w:tc>
-          <w:tcPr>
-            <w:tcW w:type="dxa" w:w="1234"/>
-          </w:tcPr>
-          <w:p>
-            <w:pPr>
-              <w:jc w:val="right"/>
-            </w:pPr>
-            <w:r>
-              <w:t>100.0%</w:t>
-            </w:r>
-          </w:p>
-        </w:tc>
-      </w:tr>
-      <w:tr>
-        <w:tc>
-          <w:tcPr>
-            <w:tcW w:type="dxa" w:w="1234"/>
-          </w:tcPr>
-          <w:p>
-            <w:r>
-              <w:t>Race_of_Mother</w:t>
-            </w:r>
-          </w:p>
-        </w:tc>
-        <w:tc>
-          <w:tcPr>
-            <w:tcW w:type="dxa" w:w="1234"/>
-          </w:tcPr>
-          <w:p>
-            <w:pPr>
-              <w:jc w:val="right"/>
-            </w:pPr>
-            <w:r>
-              <w:t>0</w:t>
-            </w:r>
-          </w:p>
-        </w:tc>
-        <w:tc>
-          <w:tcPr>
-            <w:tcW w:type="dxa" w:w="1234"/>
-          </w:tcPr>
-          <w:p>
-            <w:pPr>
-              <w:jc w:val="right"/>
-            </w:pPr>
-            <w:r>
-              <w:t>0.0%</w:t>
-            </w:r>
-          </w:p>
-        </w:tc>
-        <w:tc>
-          <w:tcPr>
-            <w:tcW w:type="dxa" w:w="1234"/>
-          </w:tcPr>
-          <w:p>
-            <w:r>
-              <w:t>str</w:t>
-            </w:r>
-          </w:p>
-        </w:tc>
-        <w:tc>
-          <w:tcPr>
-            <w:tcW w:type="dxa" w:w="1234"/>
-          </w:tcPr>
-          <w:p>
-            <w:pPr>
-              <w:jc w:val="right"/>
-            </w:pPr>
-            <w:r>
-              <w:t>12</w:t>
-            </w:r>
-          </w:p>
-        </w:tc>
-        <w:tc>
-          <w:tcPr>
-            <w:tcW w:type="dxa" w:w="1234"/>
-          </w:tcPr>
-          <w:p>
-            <w:pPr>
-              <w:jc w:val="right"/>
-            </w:pPr>
-            <w:r>
-              <w:t>336,097</w:t>
+              <w:t>336,038</w:t>
             </w:r>
           </w:p>
         </w:tc>
@@ -2248,7 +2161,7 @@
         <w:pStyle w:val="ListBullet"/>
       </w:pPr>
       <w:r>
-        <w:t>Use the 302,313 complete records for immediate analysis where possible</w:t>
+        <w:t>Use the 302,278 complete records for immediate analysis where possible</w:t>
       </w:r>
     </w:p>
     <w:p>
@@ -2387,7 +2300,7 @@
       <w:jc w:val="center"/>
     </w:pPr>
     <w:r>
-      <w:t xml:space="preserve">Birth Records Data Quality Assessment | Generated: 2026-04-01 | Page </w:t>
+      <w:t xml:space="preserve">Birth Records Data Quality Assessment | Generated: 2026-04-30 | Page </w:t>
     </w:r>
     <w:r>
       <w:fldChar w:fldCharType="begin"/>

</xml_diff>